<commit_message>
Soru tipi paylarını gerçek sınav verisiyle yeniden kalibre et
- Analize alan × kök tipi tablosu eklendi (GM, Sair, Tarife; 5 yıl ve
  2024-25 ayrı)
- GM, Sair ve Tarife promptlarındaki hedef tip payları gerçek
  dağılıma göre düzeltildi (GM'de olumsuz kök %30-35'ten %38-42'ye;
  boşluk/eşleştirme/vaka payları düşürüldü; tarifede öncüllü yok)
- Öncüllü cevap dağılımı 68 sorunun gerçek oranlarıyla güncellendi
  (%18 tek öncül, %19 tüm öncüller, %63 ara kombinasyon)

Co-Authored-By: Claude Opus 5.5 <noreply@anthropic.com>
Claude-Session: https://claude.ai/code/session_01GgDEz86kKogUAFjPuHAFPg
</commit_message>
<xml_diff>
--- a/00-SORU-YAZARI-ANALIZI-VE-PROMPTLAR/01-ANALIZ_Bakanlik-Soru-Yazarinin-Zihni_2021-2025.docx
+++ b/00-SORU-YAZARI-ANALIZI-VE-PROMPTLAR/01-ANALIZ_Bakanlik-Soru-Yazarinin-Zihni_2021-2025.docx
@@ -2,7 +2,7 @@
 <file path=word/document.xml><?xml version="1.0" encoding="utf-8"?>
 <w:document xmlns:w="http://schemas.openxmlformats.org/wordprocessingml/2006/main" xmlns:m="http://schemas.openxmlformats.org/officeDocument/2006/math" xmlns:r="http://schemas.openxmlformats.org/officeDocument/2006/relationships" xmlns:o="urn:schemas-microsoft-com:office:office" xmlns:v="urn:schemas-microsoft-com:vml" xmlns:w10="urn:schemas-microsoft-com:office:word" xmlns:a="http://schemas.openxmlformats.org/drawingml/2006/main" xmlns:pic="http://schemas.openxmlformats.org/drawingml/2006/picture" xmlns:wp="http://schemas.openxmlformats.org/drawingml/2006/wordprocessingDrawing">
   <w:body>
-    <w:bookmarkStart w:id="55" w:name="bakanlik-soru-yazarinin-zihni"/>
+    <w:bookmarkStart w:id="56" w:name="bakanlik-soru-yazarinin-zihni"/>
     <w:p>
       <w:pPr>
         <w:pStyle w:val="Heading1"/>
@@ -574,7 +574,7 @@
       </w:r>
     </w:p>
     <w:bookmarkEnd w:id="21"/>
-    <w:bookmarkStart w:id="27" w:name="sinavin-mimarisi-5-yılın-sayıları"/>
+    <w:bookmarkStart w:id="28" w:name="sinavin-mimarisi-5-yılın-sayıları"/>
     <w:p>
       <w:pPr>
         <w:pStyle w:val="Heading2"/>
@@ -2705,23 +2705,7 @@
         <w:pStyle w:val="Compact"/>
       </w:pPr>
       <w:r>
-        <w:t xml:space="preserve">Öncüllü sorularda cevap</w:t>
-      </w:r>
-      <w:r>
-        <w:t xml:space="preserve"> </w:t>
-      </w:r>
-      <w:r>
-        <w:rPr>
-          <w:bCs/>
-          <w:b/>
-        </w:rPr>
-        <w:t xml:space="preserve">uçlarda</w:t>
-      </w:r>
-      <w:r>
-        <w:t xml:space="preserve"> </w:t>
-      </w:r>
-      <w:r>
-        <w:t xml:space="preserve">toplanıyor:</w:t>
+        <w:t xml:space="preserve">Öncüllü sorularda uç cevaplar küçümsenmeyecek kadar sık: 5 yılın 68 öncüllü sorusunda %18</w:t>
       </w:r>
       <w:r>
         <w:t xml:space="preserve"> </w:t>
@@ -2730,16 +2714,13 @@
         <w:t xml:space="preserve">“</w:t>
       </w:r>
       <w:r>
-        <w:t xml:space="preserve">Yalnız I</w:t>
+        <w:t xml:space="preserve">Yalnız X</w:t>
       </w:r>
       <w:r>
         <w:t xml:space="preserve">”</w:t>
       </w:r>
       <w:r>
-        <w:t xml:space="preserve"> </w:t>
-      </w:r>
-      <w:r>
-        <w:t xml:space="preserve">gibi tek öncül ya da tüm öncüller. 2024’te 15 öncüllü sorunun 9’u böyle. 2023’te iki soruda</w:t>
+        <w:t xml:space="preserve">, %19 tüm öncüller, %63 ara kombinasyon. 2024’te bu eğilim en uçtaydı (15 sorunun 9’u uçta). 2023’te iki soruda</w:t>
       </w:r>
       <w:r>
         <w:t xml:space="preserve"> </w:t>
@@ -2817,13 +2798,13 @@
       </w:r>
     </w:p>
     <w:bookmarkEnd w:id="24"/>
-    <w:bookmarkStart w:id="25" w:name="ölçülen-bilgi-türü-5-yılın-en-sık-12si"/>
+    <w:bookmarkStart w:id="25" w:name="b-soru-tipi-alana-göre-çok-farklı"/>
     <w:p>
       <w:pPr>
         <w:pStyle w:val="Heading3"/>
       </w:pPr>
       <w:r>
-        <w:t xml:space="preserve">1.4 Ölçülen bilgi türü (5 yılın en sık 12’si)</w:t>
+        <w:t xml:space="preserve">1.3b Soru tipi alana göre çok farklı</w:t>
       </w:r>
     </w:p>
     <w:p>
@@ -2831,7 +2812,911 @@
         <w:pStyle w:val="FirstParagraph"/>
       </w:pPr>
       <w:r>
-        <w:t xml:space="preserve">Kapsam (kim/ne dahil-hariç) › Sınıflandırma kuralı › Matrah/kıymet unsuru › Usul/prosedür › Şart › Süre (+ süre başlangıcı) › Belge › Makam/yetki › Tanım › Oran/tutar/eşik › Hukuki sonuç › Yaptırım/ceza.</w:t>
+        <w:rPr>
+          <w:bCs/>
+          <w:b/>
+        </w:rPr>
+        <w:t xml:space="preserve">Alan × kök tipi (gerçek sınavlar; hesaplar hariç sözel sorular, %):</w:t>
+      </w:r>
+    </w:p>
+    <w:tbl>
+      <w:tblPr>
+        <w:tblStyle w:val="Table"/>
+        <w:tblW w:type="pct" w:w="5000"/>
+        <w:tblLook w:firstRow="1" w:lastRow="0" w:firstColumn="0" w:lastColumn="0" w:noHBand="0" w:noVBand="0" w:val="0020"/>
+        <w:jc w:val="start"/>
+      </w:tblPr>
+      <w:tblGrid>
+        <w:gridCol w:w="2227"/>
+        <w:gridCol w:w="866"/>
+        <w:gridCol w:w="866"/>
+        <w:gridCol w:w="866"/>
+        <w:gridCol w:w="990"/>
+        <w:gridCol w:w="990"/>
+        <w:gridCol w:w="1113"/>
+      </w:tblGrid>
+      <w:tr>
+        <w:trPr>
+          <w:tblHeader w:val="true"/>
+        </w:trPr>
+        <w:tc>
+          <w:tcPr/>
+          <w:p>
+            <w:pPr>
+              <w:pStyle w:val="Compact"/>
+              <w:jc w:val="left"/>
+            </w:pPr>
+            <w:r>
+              <w:t xml:space="preserve">Kök tipi</w:t>
+            </w:r>
+          </w:p>
+        </w:tc>
+        <w:tc>
+          <w:tcPr/>
+          <w:p>
+            <w:pPr>
+              <w:pStyle w:val="Compact"/>
+              <w:jc w:val="left"/>
+            </w:pPr>
+            <w:r>
+              <w:t xml:space="preserve">GM 5 yıl</w:t>
+            </w:r>
+          </w:p>
+        </w:tc>
+        <w:tc>
+          <w:tcPr/>
+          <w:p>
+            <w:pPr>
+              <w:pStyle w:val="Compact"/>
+              <w:jc w:val="left"/>
+            </w:pPr>
+            <w:r>
+              <w:t xml:space="preserve">GM 2024–25</w:t>
+            </w:r>
+          </w:p>
+        </w:tc>
+        <w:tc>
+          <w:tcPr/>
+          <w:p>
+            <w:pPr>
+              <w:pStyle w:val="Compact"/>
+              <w:jc w:val="left"/>
+            </w:pPr>
+            <w:r>
+              <w:t xml:space="preserve">Sair 5 yıl</w:t>
+            </w:r>
+          </w:p>
+        </w:tc>
+        <w:tc>
+          <w:tcPr/>
+          <w:p>
+            <w:pPr>
+              <w:pStyle w:val="Compact"/>
+              <w:jc w:val="left"/>
+            </w:pPr>
+            <w:r>
+              <w:t xml:space="preserve">Sair 2024–25</w:t>
+            </w:r>
+          </w:p>
+        </w:tc>
+        <w:tc>
+          <w:tcPr/>
+          <w:p>
+            <w:pPr>
+              <w:pStyle w:val="Compact"/>
+              <w:jc w:val="left"/>
+            </w:pPr>
+            <w:r>
+              <w:t xml:space="preserve">Tarife 5 yıl</w:t>
+            </w:r>
+          </w:p>
+        </w:tc>
+        <w:tc>
+          <w:tcPr/>
+          <w:p>
+            <w:pPr>
+              <w:pStyle w:val="Compact"/>
+              <w:jc w:val="left"/>
+            </w:pPr>
+            <w:r>
+              <w:t xml:space="preserve">Tarife 2024–25</w:t>
+            </w:r>
+          </w:p>
+        </w:tc>
+      </w:tr>
+      <w:tr>
+        <w:tc>
+          <w:tcPr/>
+          <w:p>
+            <w:pPr>
+              <w:pStyle w:val="Compact"/>
+              <w:jc w:val="left"/>
+            </w:pPr>
+            <w:r>
+              <w:t xml:space="preserve">Olumsuz</w:t>
+            </w:r>
+          </w:p>
+        </w:tc>
+        <w:tc>
+          <w:tcPr/>
+          <w:p>
+            <w:pPr>
+              <w:pStyle w:val="Compact"/>
+              <w:jc w:val="left"/>
+            </w:pPr>
+            <w:r>
+              <w:t xml:space="preserve">44</w:t>
+            </w:r>
+          </w:p>
+        </w:tc>
+        <w:tc>
+          <w:tcPr/>
+          <w:p>
+            <w:pPr>
+              <w:pStyle w:val="Compact"/>
+              <w:jc w:val="left"/>
+            </w:pPr>
+            <w:r>
+              <w:t xml:space="preserve">39</w:t>
+            </w:r>
+          </w:p>
+        </w:tc>
+        <w:tc>
+          <w:tcPr/>
+          <w:p>
+            <w:pPr>
+              <w:pStyle w:val="Compact"/>
+              <w:jc w:val="left"/>
+            </w:pPr>
+            <w:r>
+              <w:t xml:space="preserve">36</w:t>
+            </w:r>
+          </w:p>
+        </w:tc>
+        <w:tc>
+          <w:tcPr/>
+          <w:p>
+            <w:pPr>
+              <w:pStyle w:val="Compact"/>
+              <w:jc w:val="left"/>
+            </w:pPr>
+            <w:r>
+              <w:t xml:space="preserve">32</w:t>
+            </w:r>
+          </w:p>
+        </w:tc>
+        <w:tc>
+          <w:tcPr/>
+          <w:p>
+            <w:pPr>
+              <w:pStyle w:val="Compact"/>
+              <w:jc w:val="left"/>
+            </w:pPr>
+            <w:r>
+              <w:t xml:space="preserve">42</w:t>
+            </w:r>
+          </w:p>
+        </w:tc>
+        <w:tc>
+          <w:tcPr/>
+          <w:p>
+            <w:pPr>
+              <w:pStyle w:val="Compact"/>
+              <w:jc w:val="left"/>
+            </w:pPr>
+            <w:r>
+              <w:t xml:space="preserve">37</w:t>
+            </w:r>
+          </w:p>
+        </w:tc>
+      </w:tr>
+      <w:tr>
+        <w:tc>
+          <w:tcPr/>
+          <w:p>
+            <w:pPr>
+              <w:pStyle w:val="Compact"/>
+              <w:jc w:val="left"/>
+            </w:pPr>
+            <w:r>
+              <w:t xml:space="preserve">Düz (farklı olanı bul dahil)</w:t>
+            </w:r>
+          </w:p>
+        </w:tc>
+        <w:tc>
+          <w:tcPr/>
+          <w:p>
+            <w:pPr>
+              <w:pStyle w:val="Compact"/>
+              <w:jc w:val="left"/>
+            </w:pPr>
+            <w:r>
+              <w:t xml:space="preserve">18</w:t>
+            </w:r>
+          </w:p>
+        </w:tc>
+        <w:tc>
+          <w:tcPr/>
+          <w:p>
+            <w:pPr>
+              <w:pStyle w:val="Compact"/>
+              <w:jc w:val="left"/>
+            </w:pPr>
+            <w:r>
+              <w:t xml:space="preserve">13</w:t>
+            </w:r>
+          </w:p>
+        </w:tc>
+        <w:tc>
+          <w:tcPr/>
+          <w:p>
+            <w:pPr>
+              <w:pStyle w:val="Compact"/>
+              <w:jc w:val="left"/>
+            </w:pPr>
+            <w:r>
+              <w:t xml:space="preserve">27</w:t>
+            </w:r>
+          </w:p>
+        </w:tc>
+        <w:tc>
+          <w:tcPr/>
+          <w:p>
+            <w:pPr>
+              <w:pStyle w:val="Compact"/>
+              <w:jc w:val="left"/>
+            </w:pPr>
+            <w:r>
+              <w:t xml:space="preserve">22</w:t>
+            </w:r>
+          </w:p>
+        </w:tc>
+        <w:tc>
+          <w:tcPr/>
+          <w:p>
+            <w:pPr>
+              <w:pStyle w:val="Compact"/>
+              <w:jc w:val="left"/>
+            </w:pPr>
+            <w:r>
+              <w:t xml:space="preserve">34</w:t>
+            </w:r>
+          </w:p>
+        </w:tc>
+        <w:tc>
+          <w:tcPr/>
+          <w:p>
+            <w:pPr>
+              <w:pStyle w:val="Compact"/>
+              <w:jc w:val="left"/>
+            </w:pPr>
+            <w:r>
+              <w:t xml:space="preserve">43</w:t>
+            </w:r>
+          </w:p>
+        </w:tc>
+      </w:tr>
+      <w:tr>
+        <w:tc>
+          <w:tcPr/>
+          <w:p>
+            <w:pPr>
+              <w:pStyle w:val="Compact"/>
+              <w:jc w:val="left"/>
+            </w:pPr>
+            <w:r>
+              <w:t xml:space="preserve">Öncüllü</w:t>
+            </w:r>
+          </w:p>
+        </w:tc>
+        <w:tc>
+          <w:tcPr/>
+          <w:p>
+            <w:pPr>
+              <w:pStyle w:val="Compact"/>
+              <w:jc w:val="left"/>
+            </w:pPr>
+            <w:r>
+              <w:t xml:space="preserve">19</w:t>
+            </w:r>
+          </w:p>
+        </w:tc>
+        <w:tc>
+          <w:tcPr/>
+          <w:p>
+            <w:pPr>
+              <w:pStyle w:val="Compact"/>
+              <w:jc w:val="left"/>
+            </w:pPr>
+            <w:r>
+              <w:t xml:space="preserve">23</w:t>
+            </w:r>
+          </w:p>
+        </w:tc>
+        <w:tc>
+          <w:tcPr/>
+          <w:p>
+            <w:pPr>
+              <w:pStyle w:val="Compact"/>
+              <w:jc w:val="left"/>
+            </w:pPr>
+            <w:r>
+              <w:t xml:space="preserve">17</w:t>
+            </w:r>
+          </w:p>
+        </w:tc>
+        <w:tc>
+          <w:tcPr/>
+          <w:p>
+            <w:pPr>
+              <w:pStyle w:val="Compact"/>
+              <w:jc w:val="left"/>
+            </w:pPr>
+            <w:r>
+              <w:t xml:space="preserve">19</w:t>
+            </w:r>
+          </w:p>
+        </w:tc>
+        <w:tc>
+          <w:tcPr/>
+          <w:p>
+            <w:pPr>
+              <w:pStyle w:val="Compact"/>
+              <w:jc w:val="left"/>
+            </w:pPr>
+            <w:r>
+              <w:t xml:space="preserve">1</w:t>
+            </w:r>
+          </w:p>
+        </w:tc>
+        <w:tc>
+          <w:tcPr/>
+          <w:p>
+            <w:pPr>
+              <w:pStyle w:val="Compact"/>
+              <w:jc w:val="left"/>
+            </w:pPr>
+            <w:r>
+              <w:t xml:space="preserve">0</w:t>
+            </w:r>
+          </w:p>
+        </w:tc>
+      </w:tr>
+      <w:tr>
+        <w:tc>
+          <w:tcPr/>
+          <w:p>
+            <w:pPr>
+              <w:pStyle w:val="Compact"/>
+              <w:jc w:val="left"/>
+            </w:pPr>
+            <w:r>
+              <w:t xml:space="preserve">Doğru</w:t>
+            </w:r>
+          </w:p>
+        </w:tc>
+        <w:tc>
+          <w:tcPr/>
+          <w:p>
+            <w:pPr>
+              <w:pStyle w:val="Compact"/>
+              <w:jc w:val="left"/>
+            </w:pPr>
+            <w:r>
+              <w:t xml:space="preserve">9</w:t>
+            </w:r>
+          </w:p>
+        </w:tc>
+        <w:tc>
+          <w:tcPr/>
+          <w:p>
+            <w:pPr>
+              <w:pStyle w:val="Compact"/>
+              <w:jc w:val="left"/>
+            </w:pPr>
+            <w:r>
+              <w:t xml:space="preserve">10</w:t>
+            </w:r>
+          </w:p>
+        </w:tc>
+        <w:tc>
+          <w:tcPr/>
+          <w:p>
+            <w:pPr>
+              <w:pStyle w:val="Compact"/>
+              <w:jc w:val="left"/>
+            </w:pPr>
+            <w:r>
+              <w:t xml:space="preserve">6</w:t>
+            </w:r>
+          </w:p>
+        </w:tc>
+        <w:tc>
+          <w:tcPr/>
+          <w:p>
+            <w:pPr>
+              <w:pStyle w:val="Compact"/>
+              <w:jc w:val="left"/>
+            </w:pPr>
+            <w:r>
+              <w:t xml:space="preserve">5</w:t>
+            </w:r>
+          </w:p>
+        </w:tc>
+        <w:tc>
+          <w:tcPr/>
+          <w:p>
+            <w:pPr>
+              <w:pStyle w:val="Compact"/>
+              <w:jc w:val="left"/>
+            </w:pPr>
+            <w:r>
+              <w:t xml:space="preserve">9</w:t>
+            </w:r>
+          </w:p>
+        </w:tc>
+        <w:tc>
+          <w:tcPr/>
+          <w:p>
+            <w:pPr>
+              <w:pStyle w:val="Compact"/>
+              <w:jc w:val="left"/>
+            </w:pPr>
+            <w:r>
+              <w:t xml:space="preserve">6</w:t>
+            </w:r>
+          </w:p>
+        </w:tc>
+      </w:tr>
+      <w:tr>
+        <w:tc>
+          <w:tcPr/>
+          <w:p>
+            <w:pPr>
+              <w:pStyle w:val="Compact"/>
+              <w:jc w:val="left"/>
+            </w:pPr>
+            <w:r>
+              <w:t xml:space="preserve">Vaka</w:t>
+            </w:r>
+          </w:p>
+        </w:tc>
+        <w:tc>
+          <w:tcPr/>
+          <w:p>
+            <w:pPr>
+              <w:pStyle w:val="Compact"/>
+              <w:jc w:val="left"/>
+            </w:pPr>
+            <w:r>
+              <w:t xml:space="preserve">4</w:t>
+            </w:r>
+          </w:p>
+        </w:tc>
+        <w:tc>
+          <w:tcPr/>
+          <w:p>
+            <w:pPr>
+              <w:pStyle w:val="Compact"/>
+              <w:jc w:val="left"/>
+            </w:pPr>
+            <w:r>
+              <w:t xml:space="preserve">5</w:t>
+            </w:r>
+          </w:p>
+        </w:tc>
+        <w:tc>
+          <w:tcPr/>
+          <w:p>
+            <w:pPr>
+              <w:pStyle w:val="Compact"/>
+              <w:jc w:val="left"/>
+            </w:pPr>
+            <w:r>
+              <w:t xml:space="preserve">1</w:t>
+            </w:r>
+          </w:p>
+        </w:tc>
+        <w:tc>
+          <w:tcPr/>
+          <w:p>
+            <w:pPr>
+              <w:pStyle w:val="Compact"/>
+              <w:jc w:val="left"/>
+            </w:pPr>
+            <w:r>
+              <w:t xml:space="preserve">2</w:t>
+            </w:r>
+          </w:p>
+        </w:tc>
+        <w:tc>
+          <w:tcPr/>
+          <w:p>
+            <w:pPr>
+              <w:pStyle w:val="Compact"/>
+              <w:jc w:val="left"/>
+            </w:pPr>
+            <w:r>
+              <w:t xml:space="preserve">7</w:t>
+            </w:r>
+          </w:p>
+        </w:tc>
+        <w:tc>
+          <w:tcPr/>
+          <w:p>
+            <w:pPr>
+              <w:pStyle w:val="Compact"/>
+              <w:jc w:val="left"/>
+            </w:pPr>
+            <w:r>
+              <w:t xml:space="preserve">3</w:t>
+            </w:r>
+          </w:p>
+        </w:tc>
+      </w:tr>
+      <w:tr>
+        <w:tc>
+          <w:tcPr/>
+          <w:p>
+            <w:pPr>
+              <w:pStyle w:val="Compact"/>
+              <w:jc w:val="left"/>
+            </w:pPr>
+            <w:r>
+              <w:t xml:space="preserve">Kavram</w:t>
+            </w:r>
+          </w:p>
+        </w:tc>
+        <w:tc>
+          <w:tcPr/>
+          <w:p>
+            <w:pPr>
+              <w:pStyle w:val="Compact"/>
+              <w:jc w:val="left"/>
+            </w:pPr>
+            <w:r>
+              <w:t xml:space="preserve">2</w:t>
+            </w:r>
+          </w:p>
+        </w:tc>
+        <w:tc>
+          <w:tcPr/>
+          <w:p>
+            <w:pPr>
+              <w:pStyle w:val="Compact"/>
+              <w:jc w:val="left"/>
+            </w:pPr>
+            <w:r>
+              <w:t xml:space="preserve">4</w:t>
+            </w:r>
+          </w:p>
+        </w:tc>
+        <w:tc>
+          <w:tcPr/>
+          <w:p>
+            <w:pPr>
+              <w:pStyle w:val="Compact"/>
+              <w:jc w:val="left"/>
+            </w:pPr>
+            <w:r>
+              <w:t xml:space="preserve">5</w:t>
+            </w:r>
+          </w:p>
+        </w:tc>
+        <w:tc>
+          <w:tcPr/>
+          <w:p>
+            <w:pPr>
+              <w:pStyle w:val="Compact"/>
+              <w:jc w:val="left"/>
+            </w:pPr>
+            <w:r>
+              <w:t xml:space="preserve">6</w:t>
+            </w:r>
+          </w:p>
+        </w:tc>
+        <w:tc>
+          <w:tcPr/>
+          <w:p>
+            <w:pPr>
+              <w:pStyle w:val="Compact"/>
+              <w:jc w:val="left"/>
+            </w:pPr>
+            <w:r>
+              <w:t xml:space="preserve">3</w:t>
+            </w:r>
+          </w:p>
+        </w:tc>
+        <w:tc>
+          <w:tcPr/>
+          <w:p>
+            <w:pPr>
+              <w:pStyle w:val="Compact"/>
+              <w:jc w:val="left"/>
+            </w:pPr>
+            <w:r>
+              <w:t xml:space="preserve">6</w:t>
+            </w:r>
+          </w:p>
+        </w:tc>
+      </w:tr>
+      <w:tr>
+        <w:tc>
+          <w:tcPr/>
+          <w:p>
+            <w:pPr>
+              <w:pStyle w:val="Compact"/>
+              <w:jc w:val="left"/>
+            </w:pPr>
+            <w:r>
+              <w:t xml:space="preserve">Boşluk</w:t>
+            </w:r>
+          </w:p>
+        </w:tc>
+        <w:tc>
+          <w:tcPr/>
+          <w:p>
+            <w:pPr>
+              <w:pStyle w:val="Compact"/>
+              <w:jc w:val="left"/>
+            </w:pPr>
+            <w:r>
+              <w:t xml:space="preserve">3</w:t>
+            </w:r>
+          </w:p>
+        </w:tc>
+        <w:tc>
+          <w:tcPr/>
+          <w:p>
+            <w:pPr>
+              <w:pStyle w:val="Compact"/>
+              <w:jc w:val="left"/>
+            </w:pPr>
+            <w:r>
+              <w:t xml:space="preserve">4</w:t>
+            </w:r>
+          </w:p>
+        </w:tc>
+        <w:tc>
+          <w:tcPr/>
+          <w:p>
+            <w:pPr>
+              <w:pStyle w:val="Compact"/>
+              <w:jc w:val="left"/>
+            </w:pPr>
+            <w:r>
+              <w:t xml:space="preserve">4</w:t>
+            </w:r>
+          </w:p>
+        </w:tc>
+        <w:tc>
+          <w:tcPr/>
+          <w:p>
+            <w:pPr>
+              <w:pStyle w:val="Compact"/>
+              <w:jc w:val="left"/>
+            </w:pPr>
+            <w:r>
+              <w:t xml:space="preserve">6</w:t>
+            </w:r>
+          </w:p>
+        </w:tc>
+        <w:tc>
+          <w:tcPr/>
+          <w:p>
+            <w:pPr>
+              <w:pStyle w:val="Compact"/>
+              <w:jc w:val="left"/>
+            </w:pPr>
+            <w:r>
+              <w:t xml:space="preserve">1</w:t>
+            </w:r>
+          </w:p>
+        </w:tc>
+        <w:tc>
+          <w:tcPr/>
+          <w:p>
+            <w:pPr>
+              <w:pStyle w:val="Compact"/>
+              <w:jc w:val="left"/>
+            </w:pPr>
+            <w:r>
+              <w:t xml:space="preserve">0</w:t>
+            </w:r>
+          </w:p>
+        </w:tc>
+      </w:tr>
+      <w:tr>
+        <w:tc>
+          <w:tcPr/>
+          <w:p>
+            <w:pPr>
+              <w:pStyle w:val="Compact"/>
+              <w:jc w:val="left"/>
+            </w:pPr>
+            <w:r>
+              <w:t xml:space="preserve">Eşleştirme</w:t>
+            </w:r>
+          </w:p>
+        </w:tc>
+        <w:tc>
+          <w:tcPr/>
+          <w:p>
+            <w:pPr>
+              <w:pStyle w:val="Compact"/>
+              <w:jc w:val="left"/>
+            </w:pPr>
+            <w:r>
+              <w:t xml:space="preserve">2</w:t>
+            </w:r>
+          </w:p>
+        </w:tc>
+        <w:tc>
+          <w:tcPr/>
+          <w:p>
+            <w:pPr>
+              <w:pStyle w:val="Compact"/>
+              <w:jc w:val="left"/>
+            </w:pPr>
+            <w:r>
+              <w:t xml:space="preserve">2</w:t>
+            </w:r>
+          </w:p>
+        </w:tc>
+        <w:tc>
+          <w:tcPr/>
+          <w:p>
+            <w:pPr>
+              <w:pStyle w:val="Compact"/>
+              <w:jc w:val="left"/>
+            </w:pPr>
+            <w:r>
+              <w:t xml:space="preserve">5</w:t>
+            </w:r>
+          </w:p>
+        </w:tc>
+        <w:tc>
+          <w:tcPr/>
+          <w:p>
+            <w:pPr>
+              <w:pStyle w:val="Compact"/>
+              <w:jc w:val="left"/>
+            </w:pPr>
+            <w:r>
+              <w:t xml:space="preserve">8</w:t>
+            </w:r>
+          </w:p>
+        </w:tc>
+        <w:tc>
+          <w:tcPr/>
+          <w:p>
+            <w:pPr>
+              <w:pStyle w:val="Compact"/>
+              <w:jc w:val="left"/>
+            </w:pPr>
+            <w:r>
+              <w:t xml:space="preserve">1</w:t>
+            </w:r>
+          </w:p>
+        </w:tc>
+        <w:tc>
+          <w:tcPr/>
+          <w:p>
+            <w:pPr>
+              <w:pStyle w:val="Compact"/>
+              <w:jc w:val="left"/>
+            </w:pPr>
+            <w:r>
+              <w:t xml:space="preserve">3</w:t>
+            </w:r>
+          </w:p>
+        </w:tc>
+      </w:tr>
+      <w:tr>
+        <w:tc>
+          <w:tcPr/>
+          <w:p>
+            <w:pPr>
+              <w:pStyle w:val="Compact"/>
+              <w:jc w:val="left"/>
+            </w:pPr>
+            <w:r>
+              <w:t xml:space="preserve">Sıralama</w:t>
+            </w:r>
+          </w:p>
+        </w:tc>
+        <w:tc>
+          <w:tcPr/>
+          <w:p>
+            <w:pPr>
+              <w:pStyle w:val="Compact"/>
+              <w:jc w:val="left"/>
+            </w:pPr>
+            <w:r>
+              <w:t xml:space="preserve">0,5</w:t>
+            </w:r>
+          </w:p>
+        </w:tc>
+        <w:tc>
+          <w:tcPr/>
+          <w:p>
+            <w:pPr>
+              <w:pStyle w:val="Compact"/>
+              <w:jc w:val="left"/>
+            </w:pPr>
+            <w:r>
+              <w:t xml:space="preserve">0</w:t>
+            </w:r>
+          </w:p>
+        </w:tc>
+        <w:tc>
+          <w:tcPr/>
+          <w:p>
+            <w:pPr>
+              <w:pStyle w:val="Compact"/>
+              <w:jc w:val="left"/>
+            </w:pPr>
+            <w:r>
+              <w:t xml:space="preserve">1</w:t>
+            </w:r>
+          </w:p>
+        </w:tc>
+        <w:tc>
+          <w:tcPr/>
+          <w:p>
+            <w:pPr>
+              <w:pStyle w:val="Compact"/>
+              <w:jc w:val="left"/>
+            </w:pPr>
+            <w:r>
+              <w:t xml:space="preserve">0</w:t>
+            </w:r>
+          </w:p>
+        </w:tc>
+        <w:tc>
+          <w:tcPr/>
+          <w:p>
+            <w:pPr>
+              <w:pStyle w:val="Compact"/>
+              <w:jc w:val="left"/>
+            </w:pPr>
+            <w:r>
+              <w:t xml:space="preserve">1</w:t>
+            </w:r>
+          </w:p>
+        </w:tc>
+        <w:tc>
+          <w:tcPr/>
+          <w:p>
+            <w:pPr>
+              <w:pStyle w:val="Compact"/>
+              <w:jc w:val="left"/>
+            </w:pPr>
+            <w:r>
+              <w:t xml:space="preserve">3</w:t>
+            </w:r>
+          </w:p>
+        </w:tc>
+      </w:tr>
+    </w:tbl>
+    <w:p>
+      <w:pPr>
+        <w:pStyle w:val="BodyText"/>
+      </w:pPr>
+      <w:r>
+        <w:t xml:space="preserve">Öncüllü sorular (68 adet): öncül sayısı 4 → %54, 5 → %26, 3 → %19. Doğru cevap: ara kombinasyon %63, tek öncül (</w:t>
+      </w:r>
+      <w:r>
+        <w:t xml:space="preserve">“</w:t>
+      </w:r>
+      <w:r>
+        <w:t xml:space="preserve">Yalnız X</w:t>
+      </w:r>
+      <w:r>
+        <w:t xml:space="preserve">”</w:t>
+      </w:r>
+      <w:r>
+        <w:t xml:space="preserve">) %18, tüm öncüller %19. Tarifede öncüllü soru 5 yılda yalnız 1 kez kullanıldı.</w:t>
       </w:r>
     </w:p>
     <w:p>
@@ -2849,6 +3734,60 @@
         <w:t xml:space="preserve"> </w:t>
       </w:r>
       <w:r>
+        <w:t xml:space="preserve">Tarifede öncüllü soru yok denecek kadar az; tarife</w:t>
+      </w:r>
+      <w:r>
+        <w:t xml:space="preserve"> </w:t>
+      </w:r>
+      <w:r>
+        <w:t xml:space="preserve">“</w:t>
+      </w:r>
+      <w:r>
+        <w:t xml:space="preserve">farklı olanı bul / hangi fasılda</w:t>
+      </w:r>
+      <w:r>
+        <w:t xml:space="preserve">”</w:t>
+      </w:r>
+      <w:r>
+        <w:t xml:space="preserve"> </w:t>
+      </w:r>
+      <w:r>
+        <w:t xml:space="preserve">ve olumsuz kökle soruluyor. Öncüllü soru gümrük mevzuatı ve sairin aracı. Eşleştirme ve boşluk en çok sairde (ülke–belge, tebliğ–kurum, eşik–belge). Gümrük mevzuatında olumsuz kök hâlâ en büyük pay, ama öncüllüye doğru kayıyor.</w:t>
+      </w:r>
+    </w:p>
+    <w:bookmarkEnd w:id="25"/>
+    <w:bookmarkStart w:id="26" w:name="ölçülen-bilgi-türü-5-yılın-en-sık-12si"/>
+    <w:p>
+      <w:pPr>
+        <w:pStyle w:val="Heading3"/>
+      </w:pPr>
+      <w:r>
+        <w:t xml:space="preserve">1.4 Ölçülen bilgi türü (5 yılın en sık 12’si)</w:t>
+      </w:r>
+    </w:p>
+    <w:p>
+      <w:pPr>
+        <w:pStyle w:val="FirstParagraph"/>
+      </w:pPr>
+      <w:r>
+        <w:t xml:space="preserve">Kapsam (kim/ne dahil-hariç) › Sınıflandırma kuralı › Matrah/kıymet unsuru › Usul/prosedür › Şart › Süre (+ süre başlangıcı) › Belge › Makam/yetki › Tanım › Oran/tutar/eşik › Hukuki sonuç › Yaptırım/ceza.</w:t>
+      </w:r>
+    </w:p>
+    <w:p>
+      <w:pPr>
+        <w:pStyle w:val="BodyText"/>
+      </w:pPr>
+      <w:r>
+        <w:rPr>
+          <w:bCs/>
+          <w:b/>
+        </w:rPr>
+        <w:t xml:space="preserve">Okuma:</w:t>
+      </w:r>
+      <w:r>
+        <w:t xml:space="preserve"> </w:t>
+      </w:r>
+      <w:r>
         <w:t xml:space="preserve">En çok sorulan bilgi</w:t>
       </w:r>
       <w:r>
@@ -2889,8 +3828,8 @@
         <w:t xml:space="preserve">dörtlüsü sözel soruların omurgası. Bunların hepsi çeldirici üretmeye çok elverişli (komşu sayı, komşu makam, komşu belge).</w:t>
       </w:r>
     </w:p>
-    <w:bookmarkEnd w:id="25"/>
-    <w:bookmarkStart w:id="26" w:name="biçimsel-izler"/>
+    <w:bookmarkEnd w:id="26"/>
+    <w:bookmarkStart w:id="27" w:name="biçimsel-izler"/>
     <w:p>
       <w:pPr>
         <w:pStyle w:val="Heading3"/>
@@ -3326,9 +4265,9 @@
         </w:pict>
       </w:r>
     </w:p>
-    <w:bookmarkEnd w:id="26"/>
     <w:bookmarkEnd w:id="27"/>
-    <w:bookmarkStart w:id="40" w:name="X77c4dcb6a293c8715e708822cacadab55cd42b2"/>
+    <w:bookmarkEnd w:id="28"/>
+    <w:bookmarkStart w:id="41" w:name="X77c4dcb6a293c8715e708822cacadab55cd42b2"/>
     <w:p>
       <w:pPr>
         <w:pStyle w:val="Heading2"/>
@@ -3337,7 +4276,7 @@
         <w:t xml:space="preserve">2. SORU YAZARININ 12 KURALI (veriden çıkarılmış)</w:t>
       </w:r>
     </w:p>
-    <w:bookmarkStart w:id="28" w:name="Xcf6648cd06664a871cacb9fe70393bc376d064a"/>
+    <w:bookmarkStart w:id="29" w:name="Xcf6648cd06664a871cacb9fe70393bc376d064a"/>
     <w:p>
       <w:pPr>
         <w:pStyle w:val="Heading3"/>
@@ -3642,8 +4581,8 @@
         <w:t xml:space="preserve">İtiraz riskini sıfıra yaklaştırmak. Dört şık mevzuatın kendisi olduğu için tartışılamaz; bozulan unsur da tartışmasız yanlıştır.</w:t>
       </w:r>
     </w:p>
-    <w:bookmarkEnd w:id="28"/>
-    <w:bookmarkStart w:id="29" w:name="kural-2-benzer-iki-kuralı-yan-yana-koy"/>
+    <w:bookmarkEnd w:id="29"/>
+    <w:bookmarkStart w:id="30" w:name="kural-2-benzer-iki-kuralı-yan-yana-koy"/>
     <w:p>
       <w:pPr>
         <w:pStyle w:val="Heading3"/>
@@ -3793,8 +4732,8 @@
         <w:t xml:space="preserve">2023/2: müsadere (adli, 5607) ile mülkiyetin kamuya geçirilmesi (idari, 5326)</w:t>
       </w:r>
     </w:p>
-    <w:bookmarkEnd w:id="29"/>
-    <w:bookmarkStart w:id="30" w:name="kural-3-listeyi-sor-listeye-yabancı-ekle"/>
+    <w:bookmarkEnd w:id="30"/>
+    <w:bookmarkStart w:id="31" w:name="kural-3-listeyi-sor-listeye-yabancı-ekle"/>
     <w:p>
       <w:pPr>
         <w:pStyle w:val="Heading3"/>
@@ -3991,8 +4930,8 @@
         <w:t xml:space="preserve">2025/71: TIR’a taraf olmayan Libya (yeni taraf BAE ise çeldirici)</w:t>
       </w:r>
     </w:p>
-    <w:bookmarkEnd w:id="30"/>
-    <w:bookmarkStart w:id="31" w:name="kural-4-sayıyı-komşusuyla-sor"/>
+    <w:bookmarkEnd w:id="31"/>
+    <w:bookmarkStart w:id="32" w:name="kural-4-sayıyı-komşusuyla-sor"/>
     <w:p>
       <w:pPr>
         <w:pStyle w:val="Heading3"/>
@@ -4115,8 +5054,8 @@
         <w:t xml:space="preserve">İki boyutlu bilgi (ölçüt × oran, süre × başlangıç, makam × işlem) çapraz eşlenerek 5 şık üretiliyor; bir hücre doğru, dördü yanlış.</w:t>
       </w:r>
     </w:p>
-    <w:bookmarkEnd w:id="31"/>
-    <w:bookmarkStart w:id="32" w:name="kural-5-makamı-kaydır"/>
+    <w:bookmarkEnd w:id="32"/>
+    <w:bookmarkStart w:id="33" w:name="kural-5-makamı-kaydır"/>
     <w:p>
       <w:pPr>
         <w:pStyle w:val="Heading3"/>
@@ -4247,8 +5186,8 @@
         <w:t xml:space="preserve">(doğrusu: Cumhurbaşkanı)</w:t>
       </w:r>
     </w:p>
-    <w:bookmarkEnd w:id="32"/>
-    <w:bookmarkStart w:id="33" w:name="kural-6-mutlak-ifade-alarm"/>
+    <w:bookmarkEnd w:id="33"/>
+    <w:bookmarkStart w:id="34" w:name="kural-6-mutlak-ifade-alarm"/>
     <w:p>
       <w:pPr>
         <w:pStyle w:val="Heading3"/>
@@ -4502,8 +5441,8 @@
         <w:t xml:space="preserve">(2025/31) gibi kısıtlayıcı ifade serbest olan bir kuralı bozuyor.</w:t>
       </w:r>
     </w:p>
-    <w:bookmarkEnd w:id="33"/>
-    <w:bookmarkStart w:id="34" w:name="kural-7-olayın-türünü-ters-koy"/>
+    <w:bookmarkEnd w:id="34"/>
+    <w:bookmarkStart w:id="35" w:name="kural-7-olayın-türünü-ters-koy"/>
     <w:p>
       <w:pPr>
         <w:pStyle w:val="Heading3"/>
@@ -4532,8 +5471,8 @@
         <w:t xml:space="preserve">Sorumluluğu kaldıran davranış sorumluluk doğuran hâllerin arasına (2021/33), yükümlülüğü sona erdiren olay yükümlülüğü doğuranların arasına (2021/38), ticari başarısızlık geri verme sebebinin arasına (2021/34), iptal sebebi askıya alma sebeplerinin arasına (2025/90) konuyor.</w:t>
       </w:r>
     </w:p>
-    <w:bookmarkEnd w:id="34"/>
-    <w:bookmarkStart w:id="35" w:name="kural-8-kavramın-etiketini-değiştir"/>
+    <w:bookmarkEnd w:id="35"/>
+    <w:bookmarkStart w:id="36" w:name="kural-8-kavramın-etiketini-değiştir"/>
     <w:p>
       <w:pPr>
         <w:pStyle w:val="Heading3"/>
@@ -4691,8 +5630,8 @@
         <w:t xml:space="preserve">gibi uydurma kavramlar</w:t>
       </w:r>
     </w:p>
-    <w:bookmarkEnd w:id="35"/>
-    <w:bookmarkStart w:id="36" w:name="kural-9-rejimden-rejime-hüküm-taşı"/>
+    <w:bookmarkEnd w:id="36"/>
+    <w:bookmarkStart w:id="37" w:name="kural-9-rejimden-rejime-hüküm-taşı"/>
     <w:p>
       <w:pPr>
         <w:pStyle w:val="Heading3"/>
@@ -4769,8 +5708,8 @@
         <w:t xml:space="preserve">2025/65-A: ulusal teminat ortak transite</w:t>
       </w:r>
     </w:p>
-    <w:bookmarkEnd w:id="36"/>
-    <w:bookmarkStart w:id="37" w:name="kural-10-hesapta-kural-aritmetik-değil"/>
+    <w:bookmarkEnd w:id="37"/>
+    <w:bookmarkStart w:id="38" w:name="kural-10-hesapta-kural-aritmetik-değil"/>
     <w:p>
       <w:pPr>
         <w:pStyle w:val="Heading3"/>
@@ -4923,8 +5862,8 @@
         <w:t xml:space="preserve">Daha önce 2 no.lu KDV beyannamesiyle ödenmiş KDV gümrükte tekrar alınmaz (2025/14). Antrepo işleticisinin fatura ettiği KDV mahsup edilir (2025/12). Gözetim farkına isabet eden KDV indirilemez (2024/29).</w:t>
       </w:r>
     </w:p>
-    <w:bookmarkEnd w:id="37"/>
-    <w:bookmarkStart w:id="38" w:name="kural-11-sınav-yılının-mevzuatını-sor"/>
+    <w:bookmarkEnd w:id="38"/>
+    <w:bookmarkStart w:id="39" w:name="kural-11-sınav-yılının-mevzuatını-sor"/>
     <w:p>
       <w:pPr>
         <w:pStyle w:val="Heading3"/>
@@ -4953,8 +5892,8 @@
         <w:t xml:space="preserve">Vaka tarihleri sınav yılına göre kuruluyor (zamanaşımı ve kullanılmış taşıt yaşı buna göre hesaplanıyor). Rakamlar o yılın güncel rakamı: asgari ücret tarifesi (2022/56, 2024/100: 44.085 TL), götürü teminat tutarları, posta eşiği (2023: 150 Avro, 2025: 30 Avro), nakit beyan eşiği (2025: 185.000 TL).</w:t>
       </w:r>
     </w:p>
-    <w:bookmarkEnd w:id="38"/>
-    <w:bookmarkStart w:id="39" w:name="kural-12-seri-kur-çapraz-ipucu-bırak"/>
+    <w:bookmarkEnd w:id="39"/>
+    <w:bookmarkStart w:id="40" w:name="kural-12-seri-kur-çapraz-ipucu-bırak"/>
     <w:p>
       <w:pPr>
         <w:pStyle w:val="Heading3"/>
@@ -5021,9 +5960,9 @@
         </w:pict>
       </w:r>
     </w:p>
-    <w:bookmarkEnd w:id="39"/>
     <w:bookmarkEnd w:id="40"/>
-    <w:bookmarkStart w:id="45" w:name="konu-haritasi-5-yılda-ne-kadar-sorulmuş"/>
+    <w:bookmarkEnd w:id="41"/>
+    <w:bookmarkStart w:id="46" w:name="konu-haritasi-5-yılda-ne-kadar-sorulmuş"/>
     <w:p>
       <w:pPr>
         <w:pStyle w:val="Heading2"/>
@@ -5040,7 +5979,7 @@
         <w:t xml:space="preserve">500 soru 45 kanonik konuya tek tek (anahtar kelimeyle değil, soru okunarak) eşlendi. Hesap soruları içerik konusuna dağıtıldı. Bu yüzden gruplar 1.1’deki alan tablosundan farklıdır.</w:t>
       </w:r>
     </w:p>
-    <w:bookmarkStart w:id="41" w:name="grup-toplamları"/>
+    <w:bookmarkStart w:id="42" w:name="grup-toplamları"/>
     <w:p>
       <w:pPr>
         <w:pStyle w:val="Heading3"/>
@@ -5433,8 +6372,8 @@
         <w:t xml:space="preserve">Hesap sorularının konusu (59 soru): gümrük kıymeti 32 · KDV matrahı 9 · ceza/uzlaşma 7 · ÖTV 4 · antrepo teminatı 2 · İGV/MIN-MAX 2 · gözetim 1 · geçici ithalat faizi 1 · ihracat bedeli 1.</w:t>
       </w:r>
     </w:p>
-    <w:bookmarkEnd w:id="41"/>
-    <w:bookmarkStart w:id="42" w:name="konu-yıl-frekansı-45-konunun-tamamı"/>
+    <w:bookmarkEnd w:id="42"/>
+    <w:bookmarkStart w:id="43" w:name="konu-yıl-frekansı-45-konunun-tamamı"/>
     <w:p>
       <w:pPr>
         <w:pStyle w:val="Heading3"/>
@@ -10230,8 +11169,8 @@
         <w:t xml:space="preserve">5607 (10 → 2), özet beyan (7 → 0), genel hükümler ve tanımlar (6 → 0), posta-hızlı kargo (4 → 1), dış ticaret işlemleri (5 → 1).</w:t>
       </w:r>
     </w:p>
-    <w:bookmarkEnd w:id="42"/>
-    <w:bookmarkStart w:id="43" w:name="mikro-konular-en-çok-sorulan-aynı-bilgi"/>
+    <w:bookmarkEnd w:id="43"/>
+    <w:bookmarkStart w:id="44" w:name="mikro-konular-en-çok-sorulan-aynı-bilgi"/>
     <w:p>
       <w:pPr>
         <w:pStyle w:val="Heading3"/>
@@ -10686,8 +11625,8 @@
         </w:tc>
       </w:tr>
     </w:tbl>
-    <w:bookmarkEnd w:id="43"/>
-    <w:bookmarkStart w:id="44" w:name="tarifede-birebir-tekrar-eden-bilgiler"/>
+    <w:bookmarkEnd w:id="44"/>
+    <w:bookmarkStart w:id="45" w:name="tarifede-birebir-tekrar-eden-bilgiler"/>
     <w:p>
       <w:pPr>
         <w:pStyle w:val="Heading3"/>
@@ -10878,9 +11817,9 @@
         </w:pict>
       </w:r>
     </w:p>
-    <w:bookmarkEnd w:id="44"/>
     <w:bookmarkEnd w:id="45"/>
-    <w:bookmarkStart w:id="50" w:name="alan-alan-bakanlık-neyi-hedefliyor"/>
+    <w:bookmarkEnd w:id="46"/>
+    <w:bookmarkStart w:id="51" w:name="alan-alan-bakanlık-neyi-hedefliyor"/>
     <w:p>
       <w:pPr>
         <w:pStyle w:val="Heading2"/>
@@ -10889,7 +11828,7 @@
         <w:t xml:space="preserve">4. ALAN ALAN: Bakanlık neyi hedefliyor?</w:t>
       </w:r>
     </w:p>
-    <w:bookmarkStart w:id="46" w:name="gümrük-mevzuatı-yılda-4044-soru"/>
+    <w:bookmarkStart w:id="47" w:name="gümrük-mevzuatı-yılda-4044-soru"/>
     <w:p>
       <w:pPr>
         <w:pStyle w:val="Heading3"/>
@@ -11048,8 +11987,8 @@
         <w:t xml:space="preserve">Tarihli vaka: tescil, izin süresi ve kati ithalat tarihlerinden hangisi esas alınır (2025/88)</w:t>
       </w:r>
     </w:p>
-    <w:bookmarkEnd w:id="46"/>
-    <w:bookmarkStart w:id="47" w:name="sair-mevzuat-yılda-2532-soru"/>
+    <w:bookmarkEnd w:id="47"/>
+    <w:bookmarkStart w:id="48" w:name="sair-mevzuat-yılda-2532-soru"/>
     <w:p>
       <w:pPr>
         <w:pStyle w:val="Heading3"/>
@@ -11256,8 +12195,8 @@
         <w:t xml:space="preserve">ülke–belge eşleştirmesi, tebliğ–kurum eşleştirmesi, liste soruları (hangisi taraf değildir / hangisi listede yer almaz), eşik + belge boşluğu (185.000 TL / nakit beyan formu).</w:t>
       </w:r>
     </w:p>
-    <w:bookmarkEnd w:id="47"/>
-    <w:bookmarkStart w:id="48" w:name="tarife-yılda-1318-soru-tek-blok"/>
+    <w:bookmarkEnd w:id="48"/>
+    <w:bookmarkStart w:id="49" w:name="tarife-yılda-1318-soru-tek-blok"/>
     <w:p>
       <w:pPr>
         <w:pStyle w:val="Heading3"/>
@@ -11653,8 +12592,8 @@
         <w:t xml:space="preserve">(kauçuktan sandalye → 40 yerine 94).</w:t>
       </w:r>
     </w:p>
-    <w:bookmarkEnd w:id="48"/>
-    <w:bookmarkStart w:id="49" w:name="hesaplama-yılda-916-soru"/>
+    <w:bookmarkEnd w:id="49"/>
+    <w:bookmarkStart w:id="50" w:name="hesaplama-yılda-916-soru"/>
     <w:p>
       <w:pPr>
         <w:pStyle w:val="Heading3"/>
@@ -12559,9 +13498,9 @@
         </w:pict>
       </w:r>
     </w:p>
-    <w:bookmarkEnd w:id="49"/>
     <w:bookmarkEnd w:id="50"/>
-    <w:bookmarkStart w:id="51" w:name="trendler-2021-2025"/>
+    <w:bookmarkEnd w:id="51"/>
+    <w:bookmarkStart w:id="52" w:name="trendler-2021-2025"/>
     <w:p>
       <w:pPr>
         <w:pStyle w:val="Heading2"/>
@@ -12915,8 +13854,8 @@
         </w:pict>
       </w:r>
     </w:p>
-    <w:bookmarkEnd w:id="51"/>
-    <w:bookmarkStart w:id="52" w:name="sinavi-için-çikarimlar"/>
+    <w:bookmarkEnd w:id="52"/>
+    <w:bookmarkStart w:id="53" w:name="sinavi-için-çikarimlar"/>
     <w:p>
       <w:pPr>
         <w:pStyle w:val="Heading2"/>
@@ -13215,8 +14154,8 @@
         </w:pict>
       </w:r>
     </w:p>
-    <w:bookmarkEnd w:id="52"/>
-    <w:bookmarkStart w:id="53" w:name="Xa2277bedd220d5b1bad9d5ae518a1162aba3a16"/>
+    <w:bookmarkEnd w:id="53"/>
+    <w:bookmarkStart w:id="54" w:name="Xa2277bedd220d5b1bad9d5ae518a1162aba3a16"/>
     <w:p>
       <w:pPr>
         <w:pStyle w:val="Heading2"/>
@@ -13536,8 +14475,8 @@
         </w:pict>
       </w:r>
     </w:p>
-    <w:bookmarkEnd w:id="53"/>
-    <w:bookmarkStart w:id="54" w:name="öğrenciye-strateji-özeti-bonus"/>
+    <w:bookmarkEnd w:id="54"/>
+    <w:bookmarkStart w:id="55" w:name="öğrenciye-strateji-özeti-bonus"/>
     <w:p>
       <w:pPr>
         <w:pStyle w:val="Heading2"/>
@@ -13714,8 +14653,8 @@
         <w:t xml:space="preserve">Sınav içinde aynı hüküm iki kez geçebilir; kökler ve doğru öncüller birbirine ipucu verebilir.</w:t>
       </w:r>
     </w:p>
-    <w:bookmarkEnd w:id="54"/>
     <w:bookmarkEnd w:id="55"/>
+    <w:bookmarkEnd w:id="56"/>
     <w:sectPr/>
   </w:body>
 </w:document>

</xml_diff>